<commit_message>
Re-anchor elohim figures to a047ccd (was 114f660)
A quiescence probe over 4 minutes showed the head settle, then it moved during
measurement (37b486a -> a047ccd, 42 -> 43 commits), so both instrument sets were re-run
against one exact commit. Size and history moved: 26 -> 43 commits, 70 -> 77 code files,
20,639 -> 22,196 non-blank tracked lines (Python 20,423 -> 21,980), measured atomically
at a047ccd. The gate results are unchanged: 81 facts, 107 checksum-pinned, 17 declared
exemptions, 0 unclassified, traps 38/38, tamper 6/6 caught with verdict FAIL + PIN DRIFT,
7 skills, ALL_SKILLS_PASS. The repo also gained a pytest suite (32 passed), which did not
exist at the old anchor. resume.pdf/docx re-rendered.
</commit_message>
<xml_diff>
--- a/resume.docx
+++ b/resume.docx
@@ -280,7 +280,7 @@
         </w:numPr>
       </w:pPr>
       <w:r>
-        <w:t xml:space="preserve">20,639 non-blank tracked lines (Python 20,423) across 26 commits (measured at</w:t>
+        <w:t xml:space="preserve">22,196 non-blank tracked lines (Python 21,980) across 43 commits (measured at</w:t>
       </w:r>
       <w:r>
         <w:t xml:space="preserve"> </w:t>
@@ -289,7 +289,7 @@
         <w:rPr>
           <w:rStyle w:val="VerbatimChar"/>
         </w:rPr>
-        <w:t xml:space="preserve">114f660</w:t>
+        <w:t xml:space="preserve">a047ccd</w:t>
       </w:r>
       <w:r>
         <w:t xml:space="preserve">).</w:t>

</xml_diff>